<commit_message>
Update Office 18 Aug 26
</commit_message>
<xml_diff>
--- a/Hangul/docs/70 Super-Common Korean Sentences Listen Every Day to Train Your Ears and Mouth.docx
+++ b/Hangul/docs/70 Super-Common Korean Sentences Listen Every Day to Train Your Ears and Mouth.docx
@@ -1,6 +1,6 @@
 
 <file path=word/document.xml><?xml version="1.0" encoding="utf-8"?>
-<w:document xmlns:wpc="http://schemas.microsoft.com/office/word/2010/wordprocessingCanvas" xmlns:cx="http://schemas.microsoft.com/office/drawing/2014/chartex" xmlns:cx1="http://schemas.microsoft.com/office/drawing/2015/9/8/chartex" xmlns:cx2="http://schemas.microsoft.com/office/drawing/2015/10/21/chartex" xmlns:cx3="http://schemas.microsoft.com/office/drawing/2016/5/9/chartex" xmlns:cx4="http://schemas.microsoft.com/office/drawing/2016/5/10/chartex" xmlns:cx5="http://schemas.microsoft.com/office/drawing/2016/5/11/chartex" xmlns:cx6="http://schemas.microsoft.com/office/drawing/2016/5/12/chartex" xmlns:cx7="http://schemas.microsoft.com/office/drawing/2016/5/13/chartex" xmlns:cx8="http://schemas.microsoft.com/office/drawing/2016/5/14/chartex" xmlns:mc="http://schemas.openxmlformats.org/markup-compatibility/2006" xmlns:aink="http://schemas.microsoft.com/office/drawing/2016/ink" xmlns:am3d="http://schemas.microsoft.com/office/drawing/2017/model3d" xmlns:o="urn:schemas-microsoft-com:office:office" xmlns:oel="http://schemas.microsoft.com/office/2019/extlst" xmlns:r="http://schemas.openxmlformats.org/officeDocument/2006/relationships" xmlns:m="http://schemas.openxmlformats.org/officeDocument/2006/math" xmlns:v="urn:schemas-microsoft-com:vml" xmlns:wp14="http://schemas.microsoft.com/office/word/2010/wordprocessingDrawing" xmlns:wp="http://schemas.openxmlformats.org/drawingml/2006/wordprocessingDrawing" xmlns:w10="urn:schemas-microsoft-com:office:word" xmlns:w="http://schemas.openxmlformats.org/wordprocessingml/2006/main" xmlns:w14="http://schemas.microsoft.com/office/word/2010/wordml" xmlns:w15="http://schemas.microsoft.com/office/word/2012/wordml" xmlns:w16cex="http://schemas.microsoft.com/office/word/2018/wordml/cex" xmlns:w16cid="http://schemas.microsoft.com/office/word/2016/wordml/cid" xmlns:w16="http://schemas.microsoft.com/office/word/2018/wordml" xmlns:w16du="http://schemas.microsoft.com/office/word/2023/wordml/word16du" xmlns:w16sdtdh="http://schemas.microsoft.com/office/word/2020/wordml/sdtdatahash" xmlns:w16sdtfl="http://schemas.microsoft.com/office/word/2024/wordml/sdtformatlock" xmlns:w16se="http://schemas.microsoft.com/office/word/2015/wordml/symex" xmlns:wpg="http://schemas.microsoft.com/office/word/2010/wordprocessingGroup" xmlns:wpi="http://schemas.microsoft.com/office/word/2010/wordprocessingInk" xmlns:wne="http://schemas.microsoft.com/office/word/2006/wordml" xmlns:wps="http://schemas.microsoft.com/office/word/2010/wordprocessingShape" mc:Ignorable="w14 w15 w16se w16cid w16 w16cex w16sdtdh w16sdtfl w16du wp14">
+<w:document xmlns:wpc="http://schemas.microsoft.com/office/word/2010/wordprocessingCanvas" xmlns:cx="http://schemas.microsoft.com/office/drawing/2014/chartex" xmlns:cx1="http://schemas.microsoft.com/office/drawing/2015/9/8/chartex" xmlns:cx2="http://schemas.microsoft.com/office/drawing/2015/10/21/chartex" xmlns:cx3="http://schemas.microsoft.com/office/drawing/2016/5/9/chartex" xmlns:cx4="http://schemas.microsoft.com/office/drawing/2016/5/10/chartex" xmlns:cx5="http://schemas.microsoft.com/office/drawing/2016/5/11/chartex" xmlns:cx6="http://schemas.microsoft.com/office/drawing/2016/5/12/chartex" xmlns:cx7="http://schemas.microsoft.com/office/drawing/2016/5/13/chartex" xmlns:cx8="http://schemas.microsoft.com/office/drawing/2016/5/14/chartex" xmlns:mc="http://schemas.openxmlformats.org/markup-compatibility/2006" xmlns:aink="http://schemas.microsoft.com/office/drawing/2016/ink" xmlns:am3d="http://schemas.microsoft.com/office/drawing/2017/model3d" xmlns:o="urn:schemas-microsoft-com:office:office" xmlns:oel="http://schemas.microsoft.com/office/2019/extlst" xmlns:r="http://schemas.openxmlformats.org/officeDocument/2006/relationships" xmlns:m="http://schemas.openxmlformats.org/officeDocument/2006/math" xmlns:v="urn:schemas-microsoft-com:vml" xmlns:wp14="http://schemas.microsoft.com/office/word/2010/wordprocessingDrawing" xmlns:wp="http://schemas.openxmlformats.org/drawingml/2006/wordprocessingDrawing" xmlns:w10="urn:schemas-microsoft-com:office:word" xmlns:w="http://schemas.openxmlformats.org/wordprocessingml/2006/main" xmlns:w14="http://schemas.microsoft.com/office/word/2010/wordml" xmlns:w15="http://schemas.microsoft.com/office/word/2012/wordml" xmlns:w16cei="http://schemas.microsoft.com/office/word/2026/wordml/cei" xmlns:w16cex="http://schemas.microsoft.com/office/word/2018/wordml/cex" xmlns:w16cid="http://schemas.microsoft.com/office/word/2016/wordml/cid" xmlns:w16="http://schemas.microsoft.com/office/word/2018/wordml" xmlns:w16du="http://schemas.microsoft.com/office/word/2023/wordml/word16du" xmlns:w16sdtdh="http://schemas.microsoft.com/office/word/2020/wordml/sdtdatahash" xmlns:w16sdtfl="http://schemas.microsoft.com/office/word/2024/wordml/sdtformatlock" xmlns:w16se="http://schemas.microsoft.com/office/word/2015/wordml/symex" xmlns:wpg="http://schemas.microsoft.com/office/word/2010/wordprocessingGroup" xmlns:wpi="http://schemas.microsoft.com/office/word/2010/wordprocessingInk" xmlns:wne="http://schemas.microsoft.com/office/word/2006/wordml" xmlns:wps="http://schemas.microsoft.com/office/word/2010/wordprocessingShape" mc:Ignorable="w14 w15 w16se w16cid w16 w16cex w16sdtdh w16sdtfl w16du wp14">
   <w:body>
     <w:p/>
     <w:p/>
@@ -326,7 +326,21 @@
     </w:p>
     <w:p>
       <w:r>
-        <w:t xml:space="preserve">Long time no see! </w:t>
+        <w:t xml:space="preserve">Long time no </w:t>
+      </w:r>
+      <w:proofErr w:type="gramStart"/>
+      <w:r>
+        <w:t>see</w:t>
+      </w:r>
+      <w:proofErr w:type="gramEnd"/>
+      <w:r>
+        <w:t xml:space="preserve">! </w:t>
+      </w:r>
+      <w:r>
+        <w:tab/>
+      </w:r>
+      <w:r>
+        <w:tab/>
       </w:r>
       <w:r>
         <w:t>오랜만이네요</w:t>
@@ -340,6 +354,12 @@
         <w:t xml:space="preserve">I'll keep in touch. </w:t>
       </w:r>
       <w:r>
+        <w:tab/>
+      </w:r>
+      <w:r>
+        <w:tab/>
+      </w:r>
+      <w:r>
         <w:t>연락</w:t>
       </w:r>
       <w:r>
@@ -357,6 +377,12 @@
         <w:t xml:space="preserve">Get well soon. </w:t>
       </w:r>
       <w:r>
+        <w:tab/>
+      </w:r>
+      <w:r>
+        <w:tab/>
+      </w:r>
+      <w:r>
         <w:t>얼른</w:t>
       </w:r>
       <w:r>
@@ -374,6 +400,12 @@
         <w:t xml:space="preserve">I knew it. </w:t>
       </w:r>
       <w:r>
+        <w:tab/>
+      </w:r>
+      <w:r>
+        <w:tab/>
+      </w:r>
+      <w:r>
         <w:t>그럴</w:t>
       </w:r>
       <w:r>
@@ -397,6 +429,12 @@
         <w:t xml:space="preserve">I told you. </w:t>
       </w:r>
       <w:r>
+        <w:tab/>
+      </w:r>
+      <w:r>
+        <w:tab/>
+      </w:r>
+      <w:r>
         <w:t>제가</w:t>
       </w:r>
       <w:r>
@@ -414,6 +452,12 @@
         <w:t xml:space="preserve">I can't believe it. </w:t>
       </w:r>
       <w:r>
+        <w:tab/>
+      </w:r>
+      <w:r>
+        <w:tab/>
+      </w:r>
+      <w:r>
         <w:t>안</w:t>
       </w:r>
       <w:r>
@@ -431,6 +475,12 @@
         <w:t xml:space="preserve">I'm just kidding. </w:t>
       </w:r>
       <w:r>
+        <w:tab/>
+      </w:r>
+      <w:r>
+        <w:tab/>
+      </w:r>
+      <w:r>
         <w:t>장난이에요</w:t>
       </w:r>
       <w:r>
@@ -442,6 +492,12 @@
         <w:t xml:space="preserve">I'm a huge fan. </w:t>
       </w:r>
       <w:r>
+        <w:tab/>
+      </w:r>
+      <w:r>
+        <w:tab/>
+      </w:r>
+      <w:r>
         <w:t>완전</w:t>
       </w:r>
       <w:r>
@@ -459,6 +515,9 @@
         <w:t xml:space="preserve">I take back what I said. </w:t>
       </w:r>
       <w:r>
+        <w:tab/>
+      </w:r>
+      <w:r>
         <w:t>그</w:t>
       </w:r>
       <w:r>
@@ -482,6 +541,12 @@
         <w:t xml:space="preserve">I couldn't care less. </w:t>
       </w:r>
       <w:r>
+        <w:tab/>
+      </w:r>
+      <w:r>
+        <w:tab/>
+      </w:r>
+      <w:r>
         <w:t>전혀</w:t>
       </w:r>
       <w:r>
@@ -511,6 +576,12 @@
         <w:t xml:space="preserve">It's not as difficult as I thought. </w:t>
       </w:r>
       <w:r>
+        <w:tab/>
+      </w:r>
+      <w:r>
+        <w:tab/>
+      </w:r>
+      <w:r>
         <w:t>생각보다</w:t>
       </w:r>
       <w:r>
@@ -534,6 +605,12 @@
         <w:t xml:space="preserve">What's your ETA (Estimated Time of Arrival)? </w:t>
       </w:r>
       <w:r>
+        <w:tab/>
+      </w:r>
+      <w:r>
+        <w:tab/>
+      </w:r>
+      <w:r>
         <w:t>언제쯤</w:t>
       </w:r>
       <w:r>
@@ -557,6 +634,12 @@
         <w:t xml:space="preserve">We have similar taste in music. </w:t>
       </w:r>
       <w:r>
+        <w:tab/>
+      </w:r>
+      <w:r>
+        <w:tab/>
+      </w:r>
+      <w:r>
         <w:t>저랑</w:t>
       </w:r>
       <w:r>
@@ -586,6 +669,12 @@
         <w:t xml:space="preserve">I binge-watched it in a day. </w:t>
       </w:r>
       <w:r>
+        <w:tab/>
+      </w:r>
+      <w:r>
+        <w:tab/>
+      </w:r>
+      <w:r>
         <w:t>하루</w:t>
       </w:r>
       <w:r>
@@ -613,6 +702,12 @@
     <w:p>
       <w:r>
         <w:t xml:space="preserve">I'm too lazy to go out. </w:t>
+      </w:r>
+      <w:r>
+        <w:tab/>
+      </w:r>
+      <w:r>
+        <w:tab/>
       </w:r>
       <w:r>
         <w:t>나가기</w:t>
@@ -663,6 +758,12 @@
         <w:t xml:space="preserve">I'm on my way. </w:t>
       </w:r>
       <w:r>
+        <w:tab/>
+      </w:r>
+      <w:r>
+        <w:tab/>
+      </w:r>
+      <w:r>
         <w:t>가는</w:t>
       </w:r>
       <w:r>
@@ -680,6 +781,12 @@
         <w:t xml:space="preserve">I'm almost there. </w:t>
       </w:r>
       <w:r>
+        <w:tab/>
+      </w:r>
+      <w:r>
+        <w:tab/>
+      </w:r>
+      <w:r>
         <w:t>거의</w:t>
       </w:r>
       <w:r>
@@ -701,6 +808,12 @@
     <w:p>
       <w:r>
         <w:t xml:space="preserve">I'm late for class. </w:t>
+      </w:r>
+      <w:r>
+        <w:tab/>
+      </w:r>
+      <w:r>
+        <w:tab/>
       </w:r>
       <w:r>
         <w:t>수업에</w:t>
@@ -721,6 +834,12 @@
         <w:t xml:space="preserve">Take your time. </w:t>
       </w:r>
       <w:r>
+        <w:tab/>
+      </w:r>
+      <w:r>
+        <w:tab/>
+      </w:r>
+      <w:r>
         <w:t>천천히</w:t>
       </w:r>
       <w:r>
@@ -738,6 +857,12 @@
         <w:t xml:space="preserve">I'm ready. </w:t>
       </w:r>
       <w:r>
+        <w:tab/>
+      </w:r>
+      <w:r>
+        <w:tab/>
+      </w:r>
+      <w:r>
         <w:t>준비</w:t>
       </w:r>
       <w:r>
@@ -755,6 +880,12 @@
         <w:t xml:space="preserve">Can I have a bite? </w:t>
       </w:r>
       <w:r>
+        <w:tab/>
+      </w:r>
+      <w:r>
+        <w:tab/>
+      </w:r>
+      <w:r>
         <w:t>한</w:t>
       </w:r>
       <w:r>
@@ -784,6 +915,12 @@
         <w:t xml:space="preserve">Can I have a sip? </w:t>
       </w:r>
       <w:r>
+        <w:tab/>
+      </w:r>
+      <w:r>
+        <w:tab/>
+      </w:r>
+      <w:r>
         <w:t>한</w:t>
       </w:r>
       <w:r>
@@ -813,6 +950,12 @@
         <w:t xml:space="preserve">I'm a picky eater. </w:t>
       </w:r>
       <w:r>
+        <w:tab/>
+      </w:r>
+      <w:r>
+        <w:tab/>
+      </w:r>
+      <w:r>
         <w:t>저는</w:t>
       </w:r>
       <w:r>
@@ -836,6 +979,12 @@
         <w:t xml:space="preserve">It doesn't matter. </w:t>
       </w:r>
       <w:r>
+        <w:tab/>
+      </w:r>
+      <w:r>
+        <w:tab/>
+      </w:r>
+      <w:r>
         <w:t>상관없어요</w:t>
       </w:r>
       <w:r>
@@ -847,6 +996,12 @@
         <w:t xml:space="preserve">Is something wrong? </w:t>
       </w:r>
       <w:r>
+        <w:tab/>
+      </w:r>
+      <w:r>
+        <w:tab/>
+      </w:r>
+      <w:r>
         <w:t>무슨</w:t>
       </w:r>
       <w:r>
@@ -878,6 +1033,12 @@
         <w:t xml:space="preserve"> I'll be right back. </w:t>
       </w:r>
       <w:r>
+        <w:tab/>
+      </w:r>
+      <w:r>
+        <w:tab/>
+      </w:r>
+      <w:r>
         <w:t>잠깐</w:t>
       </w:r>
       <w:r>
@@ -907,6 +1068,12 @@
         <w:t xml:space="preserve">Excuse me for a moment. I'll be right back. </w:t>
       </w:r>
       <w:r>
+        <w:tab/>
+      </w:r>
+      <w:r>
+        <w:tab/>
+      </w:r>
+      <w:r>
         <w:t>잠시만요</w:t>
       </w:r>
       <w:r>
@@ -928,6 +1095,12 @@
     <w:p>
       <w:r>
         <w:t xml:space="preserve">Something came up, so I have to go. </w:t>
+      </w:r>
+      <w:r>
+        <w:tab/>
+      </w:r>
+      <w:r>
+        <w:tab/>
       </w:r>
       <w:r>
         <w:t>일이</w:t>
@@ -996,6 +1169,12 @@
         <w:t xml:space="preserve">Can I call you right now? </w:t>
       </w:r>
       <w:r>
+        <w:tab/>
+      </w:r>
+      <w:r>
+        <w:tab/>
+      </w:r>
+      <w:r>
         <w:t>지금</w:t>
       </w:r>
       <w:r>
@@ -1019,6 +1198,12 @@
         <w:t xml:space="preserve">I'll call you back soon. </w:t>
       </w:r>
       <w:r>
+        <w:tab/>
+      </w:r>
+      <w:r>
+        <w:tab/>
+      </w:r>
+      <w:r>
         <w:t>조금</w:t>
       </w:r>
       <w:r>
@@ -1050,19 +1235,20 @@
       </w:r>
     </w:p>
     <w:p>
-      <w:pPr>
+      <w:r>
+        <w:t>Could you call me again a little later?</w:t>
+      </w:r>
+      <w:r>
         <w:rPr>
           <w:rFonts w:hint="eastAsia"/>
         </w:rPr>
-      </w:pPr>
-      <w:r>
-        <w:t>Could you call me again a little later?</w:t>
-      </w:r>
-      <w:r>
-        <w:rPr>
-          <w:rFonts w:hint="eastAsia"/>
-        </w:rPr>
-        <w:t xml:space="preserve"> </w:t>
+        <w:t xml:space="preserve"> </w:t>
+      </w:r>
+      <w:r>
+        <w:tab/>
+      </w:r>
+      <w:r>
+        <w:tab/>
       </w:r>
       <w:r>
         <w:t>조금</w:t>
@@ -1100,6 +1286,12 @@
         <w:t xml:space="preserve">Can you hear me? </w:t>
       </w:r>
       <w:r>
+        <w:tab/>
+      </w:r>
+      <w:r>
+        <w:tab/>
+      </w:r>
+      <w:r>
         <w:t>들려요</w:t>
       </w:r>
       <w:r>
@@ -1111,6 +1303,12 @@
         <w:t xml:space="preserve">Can you see me? </w:t>
       </w:r>
       <w:r>
+        <w:tab/>
+      </w:r>
+      <w:r>
+        <w:tab/>
+      </w:r>
+      <w:r>
         <w:t>보여요</w:t>
       </w:r>
       <w:r>
@@ -1122,6 +1320,12 @@
         <w:t xml:space="preserve">I can't hear you. </w:t>
       </w:r>
       <w:r>
+        <w:tab/>
+      </w:r>
+      <w:r>
+        <w:tab/>
+      </w:r>
+      <w:r>
         <w:t>안</w:t>
       </w:r>
       <w:r>
@@ -1139,6 +1343,12 @@
         <w:t xml:space="preserve">I can't hear you very well. </w:t>
       </w:r>
       <w:r>
+        <w:tab/>
+      </w:r>
+      <w:r>
+        <w:tab/>
+      </w:r>
+      <w:r>
         <w:t>잘</w:t>
       </w:r>
       <w:r>
@@ -1162,6 +1372,12 @@
         <w:t xml:space="preserve">I can't see anything. </w:t>
       </w:r>
       <w:r>
+        <w:tab/>
+      </w:r>
+      <w:r>
+        <w:tab/>
+      </w:r>
+      <w:r>
         <w:t>아무것도</w:t>
       </w:r>
       <w:r>
@@ -1183,6 +1399,12 @@
     <w:p>
       <w:r>
         <w:t xml:space="preserve">What does it mean? </w:t>
+      </w:r>
+      <w:r>
+        <w:tab/>
+      </w:r>
+      <w:r>
+        <w:tab/>
       </w:r>
       <w:r>
         <w:t>무슨</w:t>
@@ -1203,6 +1425,12 @@
         <w:t xml:space="preserve">Could you slow down a bit? </w:t>
       </w:r>
       <w:r>
+        <w:tab/>
+      </w:r>
+      <w:r>
+        <w:tab/>
+      </w:r>
+      <w:r>
         <w:t>조금만</w:t>
       </w:r>
       <w:r>
@@ -1226,6 +1454,12 @@
         <w:t xml:space="preserve">I'm having trouble understanding what you said. </w:t>
       </w:r>
       <w:r>
+        <w:tab/>
+      </w:r>
+      <w:r>
+        <w:tab/>
+      </w:r>
+      <w:r>
         <w:t>잘</w:t>
       </w:r>
       <w:r>
@@ -1249,6 +1483,12 @@
         <w:t xml:space="preserve">Could you say that one more time? </w:t>
       </w:r>
       <w:r>
+        <w:tab/>
+      </w:r>
+      <w:r>
+        <w:tab/>
+      </w:r>
+      <w:r>
         <w:t>다시</w:t>
       </w:r>
       <w:r>
@@ -1278,6 +1518,12 @@
         <w:t xml:space="preserve">Please speak a little louder. </w:t>
       </w:r>
       <w:r>
+        <w:tab/>
+      </w:r>
+      <w:r>
+        <w:tab/>
+      </w:r>
+      <w:r>
         <w:t>조금</w:t>
       </w:r>
       <w:r>
@@ -1307,6 +1553,12 @@
         <w:t xml:space="preserve">Did you get it? </w:t>
       </w:r>
       <w:r>
+        <w:tab/>
+      </w:r>
+      <w:r>
+        <w:tab/>
+      </w:r>
+      <w:r>
         <w:t>이해되셨어요</w:t>
       </w:r>
       <w:r>
@@ -1318,6 +1570,12 @@
         <w:t xml:space="preserve">I cannot understand very well. </w:t>
       </w:r>
       <w:r>
+        <w:tab/>
+      </w:r>
+      <w:r>
+        <w:tab/>
+      </w:r>
+      <w:r>
         <w:t>이해가</w:t>
       </w:r>
       <w:r>
@@ -1341,6 +1599,12 @@
         <w:t xml:space="preserve">Could you explain again? </w:t>
       </w:r>
       <w:r>
+        <w:tab/>
+      </w:r>
+      <w:r>
+        <w:tab/>
+      </w:r>
+      <w:r>
         <w:t>다시</w:t>
       </w:r>
       <w:r>
@@ -1358,6 +1622,12 @@
         <w:t xml:space="preserve">The internet connection is unstable. </w:t>
       </w:r>
       <w:r>
+        <w:tab/>
+      </w:r>
+      <w:r>
+        <w:tab/>
+      </w:r>
+      <w:r>
         <w:t>인터넷이</w:t>
       </w:r>
       <w:r>
@@ -1381,6 +1651,12 @@
         <w:t xml:space="preserve">The audio is unstable. </w:t>
       </w:r>
       <w:r>
+        <w:tab/>
+      </w:r>
+      <w:r>
+        <w:tab/>
+      </w:r>
+      <w:r>
         <w:t>소리가</w:t>
       </w:r>
       <w:r>
@@ -1404,6 +1680,12 @@
         <w:t xml:space="preserve">You're muted. </w:t>
       </w:r>
       <w:r>
+        <w:tab/>
+      </w:r>
+      <w:r>
+        <w:tab/>
+      </w:r>
+      <w:r>
         <w:t>음소거</w:t>
       </w:r>
       <w:r>
@@ -1427,6 +1709,12 @@
         <w:t xml:space="preserve">Please mute yourself. </w:t>
       </w:r>
       <w:r>
+        <w:tab/>
+      </w:r>
+      <w:r>
+        <w:tab/>
+      </w:r>
+      <w:r>
         <w:t>음소거</w:t>
       </w:r>
       <w:r>
@@ -1444,6 +1732,12 @@
         <w:t xml:space="preserve">Please unmute yourself. </w:t>
       </w:r>
       <w:r>
+        <w:tab/>
+      </w:r>
+      <w:r>
+        <w:tab/>
+      </w:r>
+      <w:r>
         <w:t>음소거</w:t>
       </w:r>
       <w:r>
@@ -1461,6 +1755,12 @@
         <w:t xml:space="preserve">I don't remember. </w:t>
       </w:r>
       <w:r>
+        <w:tab/>
+      </w:r>
+      <w:r>
+        <w:tab/>
+      </w:r>
+      <w:r>
         <w:t>기억이</w:t>
       </w:r>
       <w:r>
@@ -1484,6 +1784,12 @@
         <w:t xml:space="preserve">I've completely forgotten about it. </w:t>
       </w:r>
       <w:r>
+        <w:tab/>
+      </w:r>
+      <w:r>
+        <w:tab/>
+      </w:r>
+      <w:r>
         <w:t>완전히</w:t>
       </w:r>
       <w:r>
@@ -1505,6 +1811,12 @@
     <w:p>
       <w:r>
         <w:t xml:space="preserve">Let's talk about it again next time. </w:t>
+      </w:r>
+      <w:r>
+        <w:tab/>
+      </w:r>
+      <w:r>
+        <w:tab/>
       </w:r>
       <w:r>
         <w:t>다음에</w:t>
@@ -1561,6 +1873,12 @@
         <w:t xml:space="preserve">Thank you for your help. </w:t>
       </w:r>
       <w:r>
+        <w:tab/>
+      </w:r>
+      <w:r>
+        <w:tab/>
+      </w:r>
+      <w:r>
         <w:t>도와주셔서</w:t>
       </w:r>
       <w:r>
@@ -1578,6 +1896,12 @@
         <w:t xml:space="preserve">Thank you for saying that. </w:t>
       </w:r>
       <w:r>
+        <w:tab/>
+      </w:r>
+      <w:r>
+        <w:tab/>
+      </w:r>
+      <w:r>
         <w:t>그렇게</w:t>
       </w:r>
       <w:r>
@@ -1601,6 +1925,12 @@
         <w:t xml:space="preserve">Thank you for letting me know. </w:t>
       </w:r>
       <w:r>
+        <w:tab/>
+      </w:r>
+      <w:r>
+        <w:tab/>
+      </w:r>
+      <w:r>
         <w:t>알려주셔서</w:t>
       </w:r>
       <w:r>
@@ -1616,6 +1946,12 @@
     <w:p>
       <w:r>
         <w:t xml:space="preserve">I'm sorry about the late reply. </w:t>
+      </w:r>
+      <w:r>
+        <w:tab/>
+      </w:r>
+      <w:r>
+        <w:tab/>
       </w:r>
       <w:r>
         <w:t>답변이</w:t>
@@ -1673,6 +2009,12 @@
         <w:t xml:space="preserve">I really like it! </w:t>
       </w:r>
       <w:r>
+        <w:tab/>
+      </w:r>
+      <w:r>
+        <w:tab/>
+      </w:r>
+      <w:r>
         <w:t>진짜</w:t>
       </w:r>
       <w:r>
@@ -1696,6 +2038,12 @@
         <w:t xml:space="preserve">To be honest, I don't really like it. </w:t>
       </w:r>
       <w:r>
+        <w:tab/>
+      </w:r>
+      <w:r>
+        <w:tab/>
+      </w:r>
+      <w:r>
         <w:t>솔직히</w:t>
       </w:r>
       <w:r>
@@ -1719,6 +2067,12 @@
         <w:t xml:space="preserve">I think so. </w:t>
       </w:r>
       <w:r>
+        <w:tab/>
+      </w:r>
+      <w:r>
+        <w:tab/>
+      </w:r>
+      <w:r>
         <w:t>그런</w:t>
       </w:r>
       <w:r>
@@ -1742,6 +2096,12 @@
         <w:t xml:space="preserve">I don't think so. </w:t>
       </w:r>
       <w:r>
+        <w:tab/>
+      </w:r>
+      <w:r>
+        <w:tab/>
+      </w:r>
+      <w:r>
         <w:t>아닌</w:t>
       </w:r>
       <w:r>
@@ -1762,6 +2122,12 @@
         <w:t xml:space="preserve">I agree. </w:t>
       </w:r>
       <w:r>
+        <w:tab/>
+      </w:r>
+      <w:r>
+        <w:tab/>
+      </w:r>
+      <w:r>
         <w:t>저도</w:t>
       </w:r>
       <w:r>
@@ -1785,6 +2151,12 @@
         <w:t xml:space="preserve">I disagree. </w:t>
       </w:r>
       <w:r>
+        <w:tab/>
+      </w:r>
+      <w:r>
+        <w:tab/>
+      </w:r>
+      <w:r>
         <w:t>저는</w:t>
       </w:r>
       <w:r>
@@ -1814,6 +2186,12 @@
         <w:t xml:space="preserve">It looks good on you. </w:t>
       </w:r>
       <w:r>
+        <w:tab/>
+      </w:r>
+      <w:r>
+        <w:tab/>
+      </w:r>
+      <w:r>
         <w:t>잘</w:t>
       </w:r>
       <w:r>
@@ -1831,6 +2209,12 @@
         <w:t xml:space="preserve">It looks natural. </w:t>
       </w:r>
       <w:r>
+        <w:tab/>
+      </w:r>
+      <w:r>
+        <w:tab/>
+      </w:r>
+      <w:r>
         <w:t>자연스러워</w:t>
       </w:r>
       <w:r>
@@ -1848,6 +2232,12 @@
         <w:t xml:space="preserve">It sounds natural. </w:t>
       </w:r>
       <w:r>
+        <w:tab/>
+      </w:r>
+      <w:r>
+        <w:tab/>
+      </w:r>
+      <w:r>
         <w:t>자연스럽게</w:t>
       </w:r>
       <w:r>
@@ -1865,6 +2255,12 @@
         <w:t xml:space="preserve">I hit it off with that person. </w:t>
       </w:r>
       <w:r>
+        <w:tab/>
+      </w:r>
+      <w:r>
+        <w:tab/>
+      </w:r>
+      <w:r>
         <w:t>그</w:t>
       </w:r>
       <w:r>
@@ -1892,6 +2288,12 @@
     <w:p>
       <w:r>
         <w:t xml:space="preserve">It depends on the person. </w:t>
+      </w:r>
+      <w:r>
+        <w:tab/>
+      </w:r>
+      <w:r>
+        <w:tab/>
       </w:r>
       <w:r>
         <w:t>사람마다</w:t>
@@ -1942,6 +2344,12 @@
         <w:t xml:space="preserve">Do you need help with anything? </w:t>
       </w:r>
       <w:r>
+        <w:tab/>
+      </w:r>
+      <w:r>
+        <w:tab/>
+      </w:r>
+      <w:r>
         <w:t>뭐</w:t>
       </w:r>
       <w:r>
@@ -1965,6 +2373,12 @@
         <w:t xml:space="preserve">Is this seat occupied? </w:t>
       </w:r>
       <w:r>
+        <w:tab/>
+      </w:r>
+      <w:r>
+        <w:tab/>
+      </w:r>
+      <w:r>
         <w:t>여기</w:t>
       </w:r>
       <w:r>
@@ -1988,6 +2402,12 @@
         <w:t xml:space="preserve">Can I ask you something? </w:t>
       </w:r>
       <w:r>
+        <w:tab/>
+      </w:r>
+      <w:r>
+        <w:tab/>
+      </w:r>
+      <w:r>
         <w:t>뭐</w:t>
       </w:r>
       <w:r>
@@ -2015,6 +2435,12 @@
     <w:p>
       <w:r>
         <w:t xml:space="preserve">Can you take a picture for me, please? </w:t>
+      </w:r>
+      <w:r>
+        <w:tab/>
+      </w:r>
+      <w:r>
+        <w:tab/>
       </w:r>
       <w:r>
         <w:t>사진</w:t>
@@ -2667,6 +3093,7 @@
   <w:style w:type="character" w:default="1" w:styleId="DefaultParagraphFont">
     <w:name w:val="Default Paragraph Font"/>
     <w:uiPriority w:val="1"/>
+    <w:semiHidden/>
     <w:unhideWhenUsed/>
   </w:style>
   <w:style w:type="table" w:default="1" w:styleId="TableNormal">

</xml_diff>